<commit_message>
feat: se mejora la logica de las conexion de api, de implementa validacion de los casos de sprints
</commit_message>
<xml_diff>
--- a/docs/gestion-proyecto/TexCore_Backlog_y_Planificacion_Sprints.docx
+++ b/docs/gestion-proyecto/TexCore_Backlog_y_Planificacion_Sprints.docx
@@ -3446,6 +3446,19 @@
         <w:rPr>
           <w:sz w:val="20"/>
         </w:rPr>
+        <w:t xml:space="preserve"> con los archivos de </w:t>
+      </w:r>
+      <w:r>
+        <w:rPr>
+          <w:rFonts w:ascii="Consolas" w:hAnsi="Consolas"/>
+          <w:sz w:val="20"/>
+        </w:rPr>
+        <w:t>infrastructure/docker/</w:t>
+      </w:r>
+      <w:r>
+        <w:rPr>
+          <w:sz w:val="20"/>
+        </w:rPr>
         <w:t xml:space="preserve">, </w:t>
       </w:r>
       <w:r>
@@ -4745,7 +4758,46 @@
         <w:rPr>
           <w:sz w:val="20"/>
         </w:rPr>
-        <w:t xml:space="preserve"> un push a cualquier rama, </w:t>
+        <w:t xml:space="preserve"> un push a </w:t>
+      </w:r>
+      <w:r>
+        <w:rPr>
+          <w:rFonts w:ascii="Consolas" w:hAnsi="Consolas"/>
+          <w:sz w:val="20"/>
+        </w:rPr>
+        <w:t>staging</w:t>
+      </w:r>
+      <w:r>
+        <w:rPr>
+          <w:sz w:val="20"/>
+        </w:rPr>
+        <w:t xml:space="preserve"> o un pull request hacia </w:t>
+      </w:r>
+      <w:r>
+        <w:rPr>
+          <w:rFonts w:ascii="Consolas" w:hAnsi="Consolas"/>
+          <w:sz w:val="20"/>
+        </w:rPr>
+        <w:t>staging</w:t>
+      </w:r>
+      <w:r>
+        <w:rPr>
+          <w:sz w:val="20"/>
+        </w:rPr>
+        <w:t xml:space="preserve"> o </w:t>
+      </w:r>
+      <w:r>
+        <w:rPr>
+          <w:rFonts w:ascii="Consolas" w:hAnsi="Consolas"/>
+          <w:sz w:val="20"/>
+        </w:rPr>
+        <w:t>master</w:t>
+      </w:r>
+      <w:r>
+        <w:rPr>
+          <w:sz w:val="20"/>
+        </w:rPr>
+        <w:t xml:space="preserve">, </w:t>
       </w:r>
       <w:r>
         <w:rPr>
@@ -4771,14 +4823,14 @@
         <w:rPr>
           <w:sz w:val="20"/>
         </w:rPr>
-        <w:t xml:space="preserve"> ejecuta en orden </w:t>
+        <w:t xml:space="preserve"> ejecuta el análisis estático (</w:t>
       </w:r>
       <w:r>
         <w:rPr>
           <w:rFonts w:ascii="Consolas" w:hAnsi="Consolas"/>
           <w:sz w:val="20"/>
         </w:rPr>
-        <w:t>flake8</w:t>
+        <w:t>ruff</w:t>
       </w:r>
       <w:r>
         <w:rPr>
@@ -4791,13 +4843,13 @@
           <w:rFonts w:ascii="Consolas" w:hAnsi="Consolas"/>
           <w:sz w:val="20"/>
         </w:rPr>
-        <w:t>bandit</w:t>
-      </w:r>
-      <w:r>
-        <w:rPr>
-          <w:sz w:val="20"/>
-        </w:rPr>
-        <w:t xml:space="preserve"> y </w:t>
+        <w:t>mypy</w:t>
+      </w:r>
+      <w:r>
+        <w:rPr>
+          <w:sz w:val="20"/>
+        </w:rPr>
+        <w:t xml:space="preserve">, </w:t>
       </w:r>
       <w:r>
         <w:rPr>
@@ -4810,7 +4862,20 @@
         <w:rPr>
           <w:sz w:val="20"/>
         </w:rPr>
-        <w:t xml:space="preserve">, </w:t>
+        <w:t xml:space="preserve">, Semgrep y </w:t>
+      </w:r>
+      <w:r>
+        <w:rPr>
+          <w:rFonts w:ascii="Consolas" w:hAnsi="Consolas"/>
+          <w:sz w:val="20"/>
+        </w:rPr>
+        <w:t>pip-audit</w:t>
+      </w:r>
+      <w:r>
+        <w:rPr>
+          <w:sz w:val="20"/>
+        </w:rPr>
+        <w:t xml:space="preserve">), </w:t>
       </w:r>
       <w:r>
         <w:rPr>
@@ -4881,20 +4946,20 @@
         <w:rPr>
           <w:sz w:val="20"/>
         </w:rPr>
-        <w:t xml:space="preserve"> levanta una base de datos efímera y ejecuta la suite con </w:t>
+        <w:t xml:space="preserve"> levanta un SQL Server 2022 efímero y ejecuta la suite del backend (</w:t>
       </w:r>
       <w:r>
         <w:rPr>
           <w:rFonts w:ascii="Consolas" w:hAnsi="Consolas"/>
           <w:sz w:val="20"/>
         </w:rPr>
-        <w:t>pytest</w:t>
-      </w:r>
-      <w:r>
-        <w:rPr>
-          <w:sz w:val="20"/>
-        </w:rPr>
-        <w:t>.</w:t>
+        <w:t>manage.py test</w:t>
+      </w:r>
+      <w:r>
+        <w:rPr>
+          <w:sz w:val="20"/>
+        </w:rPr>
+        <w:t>) y las de los microservicios.</w:t>
       </w:r>
     </w:p>
     <w:p>
@@ -4926,7 +4991,7 @@
         <w:rPr>
           <w:sz w:val="20"/>
         </w:rPr>
-        <w:t xml:space="preserve"> que la cobertura resultante es inferior al 75 %, </w:t>
+        <w:t xml:space="preserve"> que la cobertura resultante es inferior al 90 %, </w:t>
       </w:r>
       <w:r>
         <w:rPr>
@@ -4953,6 +5018,72 @@
           <w:sz w:val="20"/>
         </w:rPr>
         <w:t xml:space="preserve"> el pipeline falla e impide la mezcla del código.</w:t>
+      </w:r>
+    </w:p>
+    <w:p>
+      <w:pPr>
+        <w:spacing w:before="80" w:after="160"/>
+        <w:ind w:left="454"/>
+      </w:pPr>
+      <w:r>
+        <w:rPr>
+          <w:b/>
+          <w:color w:val="595959"/>
+          <w:sz w:val="19"/>
+        </w:rPr>
+        <w:t>Actualizado el 7-oct-2026:</w:t>
+      </w:r>
+      <w:r>
+        <w:rPr>
+          <w:color w:val="595959"/>
+          <w:sz w:val="19"/>
+        </w:rPr>
+        <w:t xml:space="preserve"> Ruff reemplazó a </w:t>
+      </w:r>
+      <w:r>
+        <w:rPr>
+          <w:rFonts w:ascii="Consolas" w:hAnsi="Consolas"/>
+          <w:color w:val="595959"/>
+          <w:sz w:val="19"/>
+        </w:rPr>
+        <w:t>flake8</w:t>
+      </w:r>
+      <w:r>
+        <w:rPr>
+          <w:color w:val="595959"/>
+          <w:sz w:val="19"/>
+        </w:rPr>
+        <w:t xml:space="preserve"> y </w:t>
+      </w:r>
+      <w:r>
+        <w:rPr>
+          <w:rFonts w:ascii="Consolas" w:hAnsi="Consolas"/>
+          <w:color w:val="595959"/>
+          <w:sz w:val="19"/>
+        </w:rPr>
+        <w:t>bandit</w:t>
+      </w:r>
+      <w:r>
+        <w:rPr>
+          <w:color w:val="595959"/>
+          <w:sz w:val="19"/>
+        </w:rPr>
+        <w:t xml:space="preserve"> (reglas </w:t>
+      </w:r>
+      <w:r>
+        <w:rPr>
+          <w:rFonts w:ascii="Consolas" w:hAnsi="Consolas"/>
+          <w:color w:val="595959"/>
+          <w:sz w:val="19"/>
+        </w:rPr>
+        <w:t>S</w:t>
+      </w:r>
+      <w:r>
+        <w:rPr>
+          <w:color w:val="595959"/>
+          <w:sz w:val="19"/>
+        </w:rPr>
+        <w:t>); las ramas de trabajo no corren CI por diseño (plan de CI/CD del 5-oct-2026) y el umbral de cobertura subió de 75 % a 90 %, bloqueante.</w:t>
       </w:r>
     </w:p>
     <w:p>
@@ -7625,7 +7756,22 @@
           <w:color w:val="595959"/>
           <w:sz w:val="19"/>
         </w:rPr>
-        <w:t xml:space="preserve"> — técnicas EP, BVA, CB-D.</w:t>
+        <w:t xml:space="preserve"> (CA-1, CA-3) y </w:t>
+      </w:r>
+      <w:r>
+        <w:rPr>
+          <w:rFonts w:ascii="Consolas" w:hAnsi="Consolas"/>
+          <w:color w:val="595959"/>
+          <w:sz w:val="19"/>
+        </w:rPr>
+        <w:t>gestion/tests/test_auditlog_inmutable.py</w:t>
+      </w:r>
+      <w:r>
+        <w:rPr>
+          <w:color w:val="595959"/>
+          <w:sz w:val="19"/>
+        </w:rPr>
+        <w:t xml:space="preserve"> (CA-2) — técnicas EP, BVA, CB-D.</w:t>
       </w:r>
     </w:p>
     <w:p>
@@ -11904,7 +12050,22 @@
           <w:color w:val="595959"/>
           <w:sz w:val="19"/>
         </w:rPr>
-        <w:t xml:space="preserve"> — técnica EP.</w:t>
+        <w:t xml:space="preserve"> (</w:t>
+      </w:r>
+      <w:r>
+        <w:rPr>
+          <w:rFonts w:ascii="Consolas" w:hAnsi="Consolas"/>
+          <w:color w:val="595959"/>
+          <w:sz w:val="19"/>
+        </w:rPr>
+        <w:t>PanelJefePlantaRendimientoTest</w:t>
+      </w:r>
+      <w:r>
+        <w:rPr>
+          <w:color w:val="595959"/>
+          <w:sz w:val="19"/>
+        </w:rPr>
+        <w:t>: &lt; 3 s y ≤ 34 consultas con la sede cargada) — técnicas EP, RND, CB-D.</w:t>
       </w:r>
     </w:p>
     <w:p>
@@ -12472,7 +12633,7 @@
         <w:rPr>
           <w:sz w:val="20"/>
         </w:rPr>
-        <w:t xml:space="preserve"> se almacena con precisión decimal de cuatro posiciones sin pérdida por redondeo.</w:t>
+        <w:t xml:space="preserve"> se almacena con precisión decimal de cuatro posiciones sin pérdida por redondeo. Los kilogramos del kárdex usan tres decimales.</w:t>
       </w:r>
     </w:p>
     <w:p>
@@ -12508,7 +12669,22 @@
           <w:color w:val="595959"/>
           <w:sz w:val="19"/>
         </w:rPr>
-        <w:t xml:space="preserve"> — técnicas EP, BVA, CB-D.</w:t>
+        <w:t xml:space="preserve"> y </w:t>
+      </w:r>
+      <w:r>
+        <w:rPr>
+          <w:rFonts w:ascii="Consolas" w:hAnsi="Consolas"/>
+          <w:color w:val="595959"/>
+          <w:sz w:val="19"/>
+        </w:rPr>
+        <w:t>gestion/tests/test_metros_tela_precision.py</w:t>
+      </w:r>
+      <w:r>
+        <w:rPr>
+          <w:color w:val="595959"/>
+          <w:sz w:val="19"/>
+        </w:rPr>
+        <w:t xml:space="preserve"> (CA-4) — técnicas EP, BVA, CB-D.</w:t>
       </w:r>
     </w:p>
     <w:p>
@@ -14530,7 +14706,52 @@
           <w:color w:val="595959"/>
           <w:sz w:val="19"/>
         </w:rPr>
-        <w:t xml:space="preserve"> — técnicas EP, CB-D.</w:t>
+        <w:t xml:space="preserve"> (contrato paginado y </w:t>
+      </w:r>
+      <w:r>
+        <w:rPr>
+          <w:rFonts w:ascii="Consolas" w:hAnsi="Consolas"/>
+          <w:color w:val="595959"/>
+          <w:sz w:val="19"/>
+        </w:rPr>
+        <w:t>KardexBodegaRendimientoTestCase</w:t>
+      </w:r>
+      <w:r>
+        <w:rPr>
+          <w:color w:val="595959"/>
+          <w:sz w:val="19"/>
+        </w:rPr>
+        <w:t xml:space="preserve">: &lt; 3 s y ≤ 6 consultas), </w:t>
+      </w:r>
+      <w:r>
+        <w:rPr>
+          <w:rFonts w:ascii="Consolas" w:hAnsi="Consolas"/>
+          <w:color w:val="595959"/>
+          <w:sz w:val="19"/>
+        </w:rPr>
+        <w:t>inventory/tests/test_kardex_service.py</w:t>
+      </w:r>
+      <w:r>
+        <w:rPr>
+          <w:color w:val="595959"/>
+          <w:sz w:val="19"/>
+        </w:rPr>
+        <w:t xml:space="preserve">, </w:t>
+      </w:r>
+      <w:r>
+        <w:rPr>
+          <w:rFonts w:ascii="Consolas" w:hAnsi="Consolas"/>
+          <w:color w:val="595959"/>
+          <w:sz w:val="19"/>
+        </w:rPr>
+        <w:t>internal_api/tests/test_reporting_data_kardex.py</w:t>
+      </w:r>
+      <w:r>
+        <w:rPr>
+          <w:color w:val="595959"/>
+          <w:sz w:val="19"/>
+        </w:rPr>
+        <w:t xml:space="preserve"> — técnicas EP, BVA, CB-D, RND.</w:t>
       </w:r>
     </w:p>
     <w:p>
@@ -21368,7 +21589,22 @@
           <w:color w:val="595959"/>
           <w:sz w:val="19"/>
         </w:rPr>
-        <w:t xml:space="preserve"> — técnica EP.</w:t>
+        <w:t xml:space="preserve"> y </w:t>
+      </w:r>
+      <w:r>
+        <w:rPr>
+          <w:rFonts w:ascii="Consolas" w:hAnsi="Consolas"/>
+          <w:color w:val="595959"/>
+          <w:sz w:val="19"/>
+        </w:rPr>
+        <w:t>frontend/src/components/vendedor/VendedorDashboard.cliente.test.tsx</w:t>
+      </w:r>
+      <w:r>
+        <w:rPr>
+          <w:color w:val="595959"/>
+          <w:sz w:val="19"/>
+        </w:rPr>
+        <w:t xml:space="preserve"> (cupo disponible) — técnica EP.</w:t>
       </w:r>
     </w:p>
     <w:p>
@@ -24977,7 +25213,22 @@
           <w:color w:val="595959"/>
           <w:sz w:val="19"/>
         </w:rPr>
-        <w:t xml:space="preserve"> — técnicas EP, CB-D.</w:t>
+        <w:t xml:space="preserve"> y </w:t>
+      </w:r>
+      <w:r>
+        <w:rPr>
+          <w:rFonts w:ascii="Consolas" w:hAnsi="Consolas"/>
+          <w:color w:val="595959"/>
+          <w:sz w:val="19"/>
+        </w:rPr>
+        <w:t>gestion/tests/test_configuracion_empaque_api.py</w:t>
+      </w:r>
+      <w:r>
+        <w:rPr>
+          <w:color w:val="595959"/>
+          <w:sz w:val="19"/>
+        </w:rPr>
+        <w:t xml:space="preserve"> — técnicas EP, BVA, CB-D. El Administrador de Sistemas también puede configurar cualquier sede.</w:t>
       </w:r>
     </w:p>
     <w:p>
@@ -29545,14 +29796,29 @@
           <w:color w:val="595959"/>
           <w:sz w:val="19"/>
         </w:rPr>
-        <w:t>gestion/tests/test_audit_middleware.py</w:t>
+        <w:t>inventory/tests/test_audit_logs_sede.py</w:t>
       </w:r>
       <w:r>
         <w:rPr>
           <w:color w:val="595959"/>
           <w:sz w:val="19"/>
         </w:rPr>
-        <w:t xml:space="preserve"> — técnicas EP, CB-D.</w:t>
+        <w:t xml:space="preserve"> (filtros y alcance por sede) y </w:t>
+      </w:r>
+      <w:r>
+        <w:rPr>
+          <w:rFonts w:ascii="Consolas" w:hAnsi="Consolas"/>
+          <w:color w:val="595959"/>
+          <w:sz w:val="19"/>
+        </w:rPr>
+        <w:t>frontend/src/components/shared/AuditLogViewer.test.tsx</w:t>
+      </w:r>
+      <w:r>
+        <w:rPr>
+          <w:color w:val="595959"/>
+          <w:sz w:val="19"/>
+        </w:rPr>
+        <w:t xml:space="preserve"> — técnicas EP, BVA, CB-D.</w:t>
       </w:r>
     </w:p>
     <w:p>

</xml_diff>